<commit_message>
docs: update NTECH submission with paper citations and wording fixes
- Add hyperlinked citations [1]-[5] for CRAFT, MoETuner, Metro, Libra, PROBE
- Expand EPLB/LPLB to DeepSeek official names
- Clean up L1/L2 phrasing in the technical solution
- Re-export matching PDF

Co-Authored-By: Claude Opus 4.8 (1M context) <noreply@anthropic.com>
</commit_message>
<xml_diff>
--- a/docs/NTECH_2026_MoE_Load_Balancer_Submission.docx
+++ b/docs/NTECH_2026_MoE_Load_Balancer_Submission.docx
@@ -4,7 +4,7 @@
   <w:body>
     <w:p>
       <w:pPr>
-        <w:spacing w:after="80" w:before="0" w:line="240" w:lineRule="auto"/>
+        <w:spacing w:after="80"/>
         <w:rPr>
           <w:rFonts w:ascii="Trebuchet MS" w:hAnsi="Trebuchet MS" w:cs="Trebuchet MS"/>
           <w:b/>
@@ -17,11 +17,11 @@
     </w:p>
     <w:p>
       <w:pPr>
-        <w:spacing w:after="80" w:before="0" w:line="240" w:lineRule="auto"/>
-        <w:rPr>
-          <w:rFonts w:ascii="Trebuchet MS" w:hAnsi="Trebuchet MS" w:eastAsia="Trebuchet MS" w:cs="Trebuchet MS"/>
-          <w:b w:val="1"/>
-          <w:bCs w:val="1"/>
+        <w:spacing w:after="80"/>
+        <w:rPr>
+          <w:rFonts w:ascii="Trebuchet MS" w:eastAsia="Trebuchet MS" w:hAnsi="Trebuchet MS" w:cs="Trebuchet MS"/>
+          <w:b/>
+          <w:bCs/>
           <w:sz w:val="20"/>
           <w:szCs w:val="20"/>
         </w:rPr>
@@ -30,10 +30,27 @@
         <w:rPr>
           <w:rFonts w:ascii="Trebuchet MS" w:hAnsi="Trebuchet MS"/>
           <w:b/>
-          <w:i w:val="0"/>
           <w:sz w:val="32"/>
         </w:rPr>
-        <w:t>Framework-Decoupled MoE Load Balancing for High-Performance LLM Inference</w:t>
+        <w:t xml:space="preserve">Framework-Decoupled </w:t>
+      </w:r>
+      <w:proofErr w:type="spellStart"/>
+      <w:r>
+        <w:rPr>
+          <w:rFonts w:ascii="Trebuchet MS" w:hAnsi="Trebuchet MS"/>
+          <w:b/>
+          <w:sz w:val="32"/>
+        </w:rPr>
+        <w:t>MoE</w:t>
+      </w:r>
+      <w:proofErr w:type="spellEnd"/>
+      <w:r>
+        <w:rPr>
+          <w:rFonts w:ascii="Trebuchet MS" w:hAnsi="Trebuchet MS"/>
+          <w:b/>
+          <w:sz w:val="32"/>
+        </w:rPr>
+        <w:t xml:space="preserve"> Load Balancing for High-Performance LLM Inference</w:t>
       </w:r>
     </w:p>
     <w:p>
@@ -45,9 +62,9 @@
           <w:right w:val="nil"/>
           <w:between w:val="nil"/>
         </w:pBdr>
-        <w:spacing w:after="80" w:before="0" w:line="240" w:lineRule="auto"/>
-        <w:rPr>
-          <w:rFonts w:ascii="Trebuchet MS" w:hAnsi="Trebuchet MS" w:eastAsia="Trebuchet MS" w:cs="Trebuchet MS"/>
+        <w:spacing w:after="80"/>
+        <w:rPr>
+          <w:rFonts w:ascii="Trebuchet MS" w:eastAsia="Trebuchet MS" w:hAnsi="Trebuchet MS" w:cs="Trebuchet MS"/>
           <w:color w:val="000000"/>
           <w:sz w:val="18"/>
           <w:szCs w:val="18"/>
@@ -56,9 +73,9 @@
     </w:p>
     <w:p>
       <w:pPr>
-        <w:spacing w:after="80" w:before="0" w:line="240" w:lineRule="auto"/>
-        <w:rPr>
-          <w:rFonts w:ascii="Trebuchet MS" w:hAnsi="Trebuchet MS" w:eastAsia="Trebuchet MS" w:cs="Trebuchet MS"/>
+        <w:spacing w:after="80"/>
+        <w:rPr>
+          <w:rFonts w:ascii="Trebuchet MS" w:eastAsia="Trebuchet MS" w:hAnsi="Trebuchet MS" w:cs="Trebuchet MS"/>
           <w:sz w:val="18"/>
           <w:szCs w:val="18"/>
         </w:rPr>
@@ -66,9 +83,9 @@
     </w:p>
     <w:p>
       <w:pPr>
-        <w:spacing w:after="80" w:before="0" w:line="240" w:lineRule="auto"/>
-        <w:rPr>
-          <w:rFonts w:ascii="Trebuchet MS" w:hAnsi="Trebuchet MS" w:eastAsia="Trebuchet MS" w:cs="Trebuchet MS"/>
+        <w:spacing w:after="80"/>
+        <w:rPr>
+          <w:rFonts w:ascii="Trebuchet MS" w:eastAsia="Trebuchet MS" w:hAnsi="Trebuchet MS" w:cs="Trebuchet MS"/>
           <w:b/>
           <w:sz w:val="18"/>
           <w:szCs w:val="18"/>
@@ -76,9 +93,8 @@
       </w:pPr>
       <w:r>
         <w:rPr>
-          <w:rFonts w:ascii="Trebuchet MS" w:hAnsi="Trebuchet MS" w:eastAsia="Trebuchet MS" w:cs="Trebuchet MS"/>
+          <w:rFonts w:ascii="Trebuchet MS" w:eastAsia="Trebuchet MS" w:hAnsi="Trebuchet MS" w:cs="Trebuchet MS"/>
           <w:b/>
-          <w:i w:val="0"/>
           <w:sz w:val="20"/>
           <w:szCs w:val="18"/>
         </w:rPr>
@@ -97,9 +113,9 @@
         <w:tabs>
           <w:tab w:val="left" w:pos="2175"/>
         </w:tabs>
-        <w:spacing w:after="80" w:before="0" w:line="240" w:lineRule="auto"/>
-        <w:rPr>
-          <w:rFonts w:ascii="Trebuchet MS" w:hAnsi="Trebuchet MS" w:eastAsia="Trebuchet MS" w:cs="Trebuchet MS"/>
+        <w:spacing w:after="80"/>
+        <w:rPr>
+          <w:rFonts w:ascii="Trebuchet MS" w:eastAsia="Trebuchet MS" w:hAnsi="Trebuchet MS" w:cs="Trebuchet MS"/>
           <w:i/>
           <w:iCs/>
           <w:color w:val="000000"/>
@@ -107,20 +123,76 @@
           <w:szCs w:val="18"/>
         </w:rPr>
       </w:pPr>
-      <w:r>
-        <w:rPr>
-          <w:rFonts w:ascii="Trebuchet MS" w:hAnsi="Trebuchet MS"/>
-          <w:i w:val="0"/>
-          <w:sz w:val="18"/>
-        </w:rPr>
-        <w:t>MoE inference performance is limited by expert-parallel load imbalance. Static expert placement helps, but live batches can still overload a subset of EP ranks, shared-expert work can remain poorly distributed, and replicated routed experts need per-batch routing decisions. At the same time, each new load-balancing idea is usually integrated separately into SGLang, vLLM, TensorRT-LLM, or other runtimes, creating duplicated engineering work and slowing product adoption.</w:t>
+      <w:proofErr w:type="spellStart"/>
+      <w:r>
+        <w:rPr>
+          <w:rFonts w:ascii="Trebuchet MS" w:hAnsi="Trebuchet MS"/>
+          <w:sz w:val="18"/>
+        </w:rPr>
+        <w:t>MoE</w:t>
+      </w:r>
+      <w:proofErr w:type="spellEnd"/>
+      <w:r>
+        <w:rPr>
+          <w:rFonts w:ascii="Trebuchet MS" w:hAnsi="Trebuchet MS"/>
+          <w:sz w:val="18"/>
+        </w:rPr>
+        <w:t xml:space="preserve"> inference performance is limited by expert-parallel load imbalance. Static expert placement helps, but live batches can still overload a subset of EP ranks, shared-expert work can remain poorly distributed, and replicated routed experts need per-batch routing decisions. At the same time, each new load-balancing idea is usually integrated separately into </w:t>
+      </w:r>
+      <w:proofErr w:type="spellStart"/>
+      <w:r>
+        <w:rPr>
+          <w:rFonts w:ascii="Trebuchet MS" w:hAnsi="Trebuchet MS"/>
+          <w:sz w:val="18"/>
+        </w:rPr>
+        <w:t>SGLang</w:t>
+      </w:r>
+      <w:proofErr w:type="spellEnd"/>
+      <w:r>
+        <w:rPr>
+          <w:rFonts w:ascii="Trebuchet MS" w:hAnsi="Trebuchet MS"/>
+          <w:sz w:val="18"/>
+        </w:rPr>
+        <w:t xml:space="preserve">, </w:t>
+      </w:r>
+      <w:proofErr w:type="spellStart"/>
+      <w:r>
+        <w:rPr>
+          <w:rFonts w:ascii="Trebuchet MS" w:hAnsi="Trebuchet MS"/>
+          <w:sz w:val="18"/>
+        </w:rPr>
+        <w:t>vLLM</w:t>
+      </w:r>
+      <w:proofErr w:type="spellEnd"/>
+      <w:r>
+        <w:rPr>
+          <w:rFonts w:ascii="Trebuchet MS" w:hAnsi="Trebuchet MS"/>
+          <w:sz w:val="18"/>
+        </w:rPr>
+        <w:t xml:space="preserve">, </w:t>
+      </w:r>
+      <w:proofErr w:type="spellStart"/>
+      <w:r>
+        <w:rPr>
+          <w:rFonts w:ascii="Trebuchet MS" w:hAnsi="Trebuchet MS"/>
+          <w:sz w:val="18"/>
+        </w:rPr>
+        <w:t>TensorRT</w:t>
+      </w:r>
+      <w:proofErr w:type="spellEnd"/>
+      <w:r>
+        <w:rPr>
+          <w:rFonts w:ascii="Trebuchet MS" w:hAnsi="Trebuchet MS"/>
+          <w:sz w:val="18"/>
+        </w:rPr>
+        <w:t>-LLM, or other runtimes, creating duplicated engineering work and slowing product adoption.</w:t>
       </w:r>
     </w:p>
     <w:p>
       <w:pPr>
-        <w:spacing w:after="80" w:before="0" w:line="240" w:lineRule="auto"/>
-        <w:rPr>
-          <w:rFonts w:ascii="Trebuchet MS" w:hAnsi="Trebuchet MS" w:eastAsia="Trebuchet MS" w:cs="Trebuchet MS"/>
+        <w:spacing w:after="80"/>
+        <w:rPr>
+          <w:rFonts w:ascii="Trebuchet MS" w:eastAsia="Trebuchet MS" w:hAnsi="Trebuchet MS" w:cs="Trebuchet MS"/>
           <w:bCs/>
           <w:sz w:val="18"/>
           <w:szCs w:val="18"/>
@@ -129,9 +201,9 @@
     </w:p>
     <w:p>
       <w:pPr>
-        <w:spacing w:after="80" w:before="0" w:line="240" w:lineRule="auto"/>
-        <w:rPr>
-          <w:rFonts w:ascii="Trebuchet MS" w:hAnsi="Trebuchet MS" w:eastAsia="Trebuchet MS" w:cs="Trebuchet MS"/>
+        <w:spacing w:after="80"/>
+        <w:rPr>
+          <w:rFonts w:ascii="Trebuchet MS" w:eastAsia="Trebuchet MS" w:hAnsi="Trebuchet MS" w:cs="Trebuchet MS"/>
           <w:b/>
           <w:sz w:val="18"/>
           <w:szCs w:val="18"/>
@@ -139,9 +211,8 @@
       </w:pPr>
       <w:r>
         <w:rPr>
-          <w:rFonts w:ascii="Trebuchet MS" w:hAnsi="Trebuchet MS" w:eastAsia="Trebuchet MS" w:cs="Trebuchet MS"/>
+          <w:rFonts w:ascii="Trebuchet MS" w:eastAsia="Trebuchet MS" w:hAnsi="Trebuchet MS" w:cs="Trebuchet MS"/>
           <w:b/>
-          <w:i w:val="0"/>
           <w:sz w:val="20"/>
           <w:szCs w:val="18"/>
         </w:rPr>
@@ -150,9 +221,9 @@
     </w:p>
     <w:p>
       <w:pPr>
-        <w:spacing w:after="80" w:before="0" w:line="240" w:lineRule="auto"/>
-        <w:rPr>
-          <w:rFonts w:ascii="Trebuchet MS" w:hAnsi="Trebuchet MS" w:eastAsia="Trebuchet MS" w:cs="Trebuchet MS"/>
+        <w:spacing w:after="80"/>
+        <w:rPr>
+          <w:rFonts w:ascii="Trebuchet MS" w:eastAsia="Trebuchet MS" w:hAnsi="Trebuchet MS" w:cs="Trebuchet MS"/>
           <w:i/>
           <w:iCs/>
           <w:sz w:val="18"/>
@@ -162,17 +233,112 @@
       <w:r>
         <w:rPr>
           <w:rFonts w:ascii="Trebuchet MS" w:hAnsi="Trebuchet MS"/>
-          <w:i w:val="0"/>
-          <w:sz w:val="18"/>
-        </w:rPr>
-        <w:t>Large MoE models are becoming central to high-throughput LLM serving. A portable MoE load balancer can improve NVIDIA GPU utilization, reduce serving cost, and make new MoE algorithms easier to productize across inference frameworks. The work also creates a common path from research prototypes to production stacks such as SGLang, vLLM, and TensorRT-LLM, reducing the N algorithms x M frameworks integration cost.</w:t>
+          <w:sz w:val="18"/>
+        </w:rPr>
+        <w:t xml:space="preserve">Large </w:t>
+      </w:r>
+      <w:proofErr w:type="spellStart"/>
+      <w:r>
+        <w:rPr>
+          <w:rFonts w:ascii="Trebuchet MS" w:hAnsi="Trebuchet MS"/>
+          <w:sz w:val="18"/>
+        </w:rPr>
+        <w:t>MoE</w:t>
+      </w:r>
+      <w:proofErr w:type="spellEnd"/>
+      <w:r>
+        <w:rPr>
+          <w:rFonts w:ascii="Trebuchet MS" w:hAnsi="Trebuchet MS"/>
+          <w:sz w:val="18"/>
+        </w:rPr>
+        <w:t xml:space="preserve"> models are becoming central to high-throughput LLM serving. A portable </w:t>
+      </w:r>
+      <w:proofErr w:type="spellStart"/>
+      <w:r>
+        <w:rPr>
+          <w:rFonts w:ascii="Trebuchet MS" w:hAnsi="Trebuchet MS"/>
+          <w:sz w:val="18"/>
+        </w:rPr>
+        <w:t>MoE</w:t>
+      </w:r>
+      <w:proofErr w:type="spellEnd"/>
+      <w:r>
+        <w:rPr>
+          <w:rFonts w:ascii="Trebuchet MS" w:hAnsi="Trebuchet MS"/>
+          <w:sz w:val="18"/>
+        </w:rPr>
+        <w:t xml:space="preserve"> load balancer can improve NVIDIA GPU utilization, reduce serving cost, and make new </w:t>
+      </w:r>
+      <w:proofErr w:type="spellStart"/>
+      <w:r>
+        <w:rPr>
+          <w:rFonts w:ascii="Trebuchet MS" w:hAnsi="Trebuchet MS"/>
+          <w:sz w:val="18"/>
+        </w:rPr>
+        <w:t>MoE</w:t>
+      </w:r>
+      <w:proofErr w:type="spellEnd"/>
+      <w:r>
+        <w:rPr>
+          <w:rFonts w:ascii="Trebuchet MS" w:hAnsi="Trebuchet MS"/>
+          <w:sz w:val="18"/>
+        </w:rPr>
+        <w:t xml:space="preserve"> algorithms easier to productize across inference frameworks. The work also creates a common path from research prototypes to production stacks such as </w:t>
+      </w:r>
+      <w:proofErr w:type="spellStart"/>
+      <w:r>
+        <w:rPr>
+          <w:rFonts w:ascii="Trebuchet MS" w:hAnsi="Trebuchet MS"/>
+          <w:sz w:val="18"/>
+        </w:rPr>
+        <w:t>SGLang</w:t>
+      </w:r>
+      <w:proofErr w:type="spellEnd"/>
+      <w:r>
+        <w:rPr>
+          <w:rFonts w:ascii="Trebuchet MS" w:hAnsi="Trebuchet MS"/>
+          <w:sz w:val="18"/>
+        </w:rPr>
+        <w:t xml:space="preserve">, </w:t>
+      </w:r>
+      <w:proofErr w:type="spellStart"/>
+      <w:r>
+        <w:rPr>
+          <w:rFonts w:ascii="Trebuchet MS" w:hAnsi="Trebuchet MS"/>
+          <w:sz w:val="18"/>
+        </w:rPr>
+        <w:t>vLLM</w:t>
+      </w:r>
+      <w:proofErr w:type="spellEnd"/>
+      <w:r>
+        <w:rPr>
+          <w:rFonts w:ascii="Trebuchet MS" w:hAnsi="Trebuchet MS"/>
+          <w:sz w:val="18"/>
+        </w:rPr>
+        <w:t xml:space="preserve">, and </w:t>
+      </w:r>
+      <w:proofErr w:type="spellStart"/>
+      <w:r>
+        <w:rPr>
+          <w:rFonts w:ascii="Trebuchet MS" w:hAnsi="Trebuchet MS"/>
+          <w:sz w:val="18"/>
+        </w:rPr>
+        <w:t>TensorRT</w:t>
+      </w:r>
+      <w:proofErr w:type="spellEnd"/>
+      <w:r>
+        <w:rPr>
+          <w:rFonts w:ascii="Trebuchet MS" w:hAnsi="Trebuchet MS"/>
+          <w:sz w:val="18"/>
+        </w:rPr>
+        <w:t>-LLM, reducing the N algorithms x M frameworks integration cost.</w:t>
       </w:r>
     </w:p>
     <w:p>
       <w:pPr>
-        <w:spacing w:after="80" w:before="0" w:line="240" w:lineRule="auto"/>
-        <w:rPr>
-          <w:rFonts w:ascii="Trebuchet MS" w:hAnsi="Trebuchet MS" w:eastAsia="Trebuchet MS" w:cs="Trebuchet MS"/>
+        <w:spacing w:after="80"/>
+        <w:rPr>
+          <w:rFonts w:ascii="Trebuchet MS" w:eastAsia="Trebuchet MS" w:hAnsi="Trebuchet MS" w:cs="Trebuchet MS"/>
           <w:bCs/>
           <w:sz w:val="18"/>
           <w:szCs w:val="18"/>
@@ -181,9 +347,9 @@
     </w:p>
     <w:p>
       <w:pPr>
-        <w:spacing w:after="80" w:before="0" w:line="240" w:lineRule="auto"/>
-        <w:rPr>
-          <w:rFonts w:ascii="Trebuchet MS" w:hAnsi="Trebuchet MS" w:eastAsia="Trebuchet MS" w:cs="Trebuchet MS"/>
+        <w:spacing w:after="80"/>
+        <w:rPr>
+          <w:rFonts w:ascii="Trebuchet MS" w:eastAsia="Trebuchet MS" w:hAnsi="Trebuchet MS" w:cs="Trebuchet MS"/>
           <w:b/>
           <w:sz w:val="18"/>
           <w:szCs w:val="18"/>
@@ -191,9 +357,8 @@
       </w:pPr>
       <w:r>
         <w:rPr>
-          <w:rFonts w:ascii="Trebuchet MS" w:hAnsi="Trebuchet MS" w:eastAsia="Trebuchet MS" w:cs="Trebuchet MS"/>
+          <w:rFonts w:ascii="Trebuchet MS" w:eastAsia="Trebuchet MS" w:hAnsi="Trebuchet MS" w:cs="Trebuchet MS"/>
           <w:b/>
-          <w:i w:val="0"/>
           <w:sz w:val="20"/>
           <w:szCs w:val="18"/>
         </w:rPr>
@@ -202,9 +367,9 @@
     </w:p>
     <w:p>
       <w:pPr>
-        <w:spacing w:after="80" w:before="0" w:line="240" w:lineRule="auto"/>
-        <w:rPr>
-          <w:rFonts w:ascii="Trebuchet MS" w:hAnsi="Trebuchet MS" w:eastAsia="Trebuchet MS" w:cs="Trebuchet MS"/>
+        <w:spacing w:after="80"/>
+        <w:rPr>
+          <w:rFonts w:ascii="Trebuchet MS" w:eastAsia="Trebuchet MS" w:hAnsi="Trebuchet MS" w:cs="Trebuchet MS"/>
           <w:bCs/>
           <w:i/>
           <w:iCs/>
@@ -212,20 +377,286 @@
           <w:szCs w:val="18"/>
         </w:rPr>
       </w:pPr>
-      <w:r>
-        <w:rPr>
-          <w:rFonts w:ascii="Trebuchet MS" w:hAnsi="Trebuchet MS"/>
-          <w:i w:val="0"/>
-          <w:sz w:val="18"/>
-        </w:rPr>
-        <w:t>The design builds on DeepSeek EPLB/LPLB, SGLang DeepEP and Waterfill work, vLLM EPLB support, TensorRT-LLM Wide-EP/online EPLB, and recent research such as topology-aware EPLB, CRAFT, MoETuner, Metro, Libra, and PROBE. These systems demonstrate strong individual techniques, but their implementations are tied to specific runtime APIs. This submission focuses on turning those ideas into a framework-neutral load-balancing layer with thin runtime adapters.</w:t>
+      <w:bookmarkStart w:id="0" w:name="OLE_LINK4"/>
+      <w:r>
+        <w:rPr>
+          <w:rFonts w:ascii="Trebuchet MS" w:hAnsi="Trebuchet MS"/>
+          <w:sz w:val="18"/>
+        </w:rPr>
+        <w:t xml:space="preserve">The design builds on DeepSeek </w:t>
+      </w:r>
+      <w:r>
+        <w:rPr>
+          <w:rFonts w:ascii="Trebuchet MS" w:hAnsi="Trebuchet MS"/>
+          <w:sz w:val="18"/>
+        </w:rPr>
+        <w:t>Expert Parallelism Load Balancer (</w:t>
+      </w:r>
+      <w:r>
+        <w:rPr>
+          <w:rFonts w:ascii="Trebuchet MS" w:hAnsi="Trebuchet MS"/>
+          <w:sz w:val="18"/>
+        </w:rPr>
+        <w:t>EPLB</w:t>
+      </w:r>
+      <w:r>
+        <w:rPr>
+          <w:rFonts w:ascii="Trebuchet MS" w:hAnsi="Trebuchet MS"/>
+          <w:sz w:val="18"/>
+        </w:rPr>
+        <w:t>)</w:t>
+      </w:r>
+      <w:r>
+        <w:rPr>
+          <w:rFonts w:ascii="Trebuchet MS" w:hAnsi="Trebuchet MS"/>
+          <w:sz w:val="18"/>
+        </w:rPr>
+        <w:t>/</w:t>
+      </w:r>
+      <w:r>
+        <w:rPr>
+          <w:rFonts w:ascii="Trebuchet MS" w:hAnsi="Trebuchet MS"/>
+          <w:sz w:val="18"/>
+        </w:rPr>
+        <w:t>Linear-Programming-based Load Balancer (</w:t>
+      </w:r>
+      <w:r>
+        <w:rPr>
+          <w:rFonts w:ascii="Trebuchet MS" w:hAnsi="Trebuchet MS"/>
+          <w:sz w:val="18"/>
+        </w:rPr>
+        <w:t>LPLB</w:t>
+      </w:r>
+      <w:r>
+        <w:rPr>
+          <w:rFonts w:ascii="Trebuchet MS" w:hAnsi="Trebuchet MS"/>
+          <w:sz w:val="18"/>
+        </w:rPr>
+        <w:t>)</w:t>
+      </w:r>
+      <w:r>
+        <w:rPr>
+          <w:rFonts w:ascii="Trebuchet MS" w:hAnsi="Trebuchet MS"/>
+          <w:sz w:val="18"/>
+        </w:rPr>
+        <w:t xml:space="preserve">, </w:t>
+      </w:r>
+      <w:proofErr w:type="spellStart"/>
+      <w:r>
+        <w:rPr>
+          <w:rFonts w:ascii="Trebuchet MS" w:hAnsi="Trebuchet MS"/>
+          <w:sz w:val="18"/>
+        </w:rPr>
+        <w:t>SGLang</w:t>
+      </w:r>
+      <w:proofErr w:type="spellEnd"/>
+      <w:r>
+        <w:rPr>
+          <w:rFonts w:ascii="Trebuchet MS" w:hAnsi="Trebuchet MS"/>
+          <w:sz w:val="18"/>
+        </w:rPr>
+        <w:t xml:space="preserve"> </w:t>
+      </w:r>
+      <w:proofErr w:type="spellStart"/>
+      <w:r>
+        <w:rPr>
+          <w:rFonts w:ascii="Trebuchet MS" w:hAnsi="Trebuchet MS"/>
+          <w:sz w:val="18"/>
+        </w:rPr>
+        <w:t>DeepEP</w:t>
+      </w:r>
+      <w:proofErr w:type="spellEnd"/>
+      <w:r>
+        <w:rPr>
+          <w:rFonts w:ascii="Trebuchet MS" w:hAnsi="Trebuchet MS"/>
+          <w:sz w:val="18"/>
+        </w:rPr>
+        <w:t xml:space="preserve"> and </w:t>
+      </w:r>
+      <w:proofErr w:type="spellStart"/>
+      <w:r>
+        <w:rPr>
+          <w:rFonts w:ascii="Trebuchet MS" w:hAnsi="Trebuchet MS"/>
+          <w:sz w:val="18"/>
+        </w:rPr>
+        <w:t>Waterfill</w:t>
+      </w:r>
+      <w:proofErr w:type="spellEnd"/>
+      <w:r>
+        <w:rPr>
+          <w:rFonts w:ascii="Trebuchet MS" w:hAnsi="Trebuchet MS"/>
+          <w:sz w:val="18"/>
+        </w:rPr>
+        <w:t xml:space="preserve"> work, </w:t>
+      </w:r>
+      <w:proofErr w:type="spellStart"/>
+      <w:r>
+        <w:rPr>
+          <w:rFonts w:ascii="Trebuchet MS" w:hAnsi="Trebuchet MS"/>
+          <w:sz w:val="18"/>
+        </w:rPr>
+        <w:t>vLLM</w:t>
+      </w:r>
+      <w:proofErr w:type="spellEnd"/>
+      <w:r>
+        <w:rPr>
+          <w:rFonts w:ascii="Trebuchet MS" w:hAnsi="Trebuchet MS"/>
+          <w:sz w:val="18"/>
+        </w:rPr>
+        <w:t xml:space="preserve"> EPLB support, </w:t>
+      </w:r>
+      <w:proofErr w:type="spellStart"/>
+      <w:r>
+        <w:rPr>
+          <w:rFonts w:ascii="Trebuchet MS" w:hAnsi="Trebuchet MS"/>
+          <w:sz w:val="18"/>
+        </w:rPr>
+        <w:t>TensorRT</w:t>
+      </w:r>
+      <w:proofErr w:type="spellEnd"/>
+      <w:r>
+        <w:rPr>
+          <w:rFonts w:ascii="Trebuchet MS" w:hAnsi="Trebuchet MS"/>
+          <w:sz w:val="18"/>
+        </w:rPr>
+        <w:t xml:space="preserve">-LLM Wide-EP/online EPLB, </w:t>
+      </w:r>
+      <w:r>
+        <w:rPr>
+          <w:rFonts w:ascii="Trebuchet MS" w:hAnsi="Trebuchet MS"/>
+          <w:sz w:val="18"/>
+        </w:rPr>
+        <w:t xml:space="preserve">and </w:t>
+      </w:r>
+      <w:r>
+        <w:rPr>
+          <w:rFonts w:ascii="Trebuchet MS" w:hAnsi="Trebuchet MS"/>
+          <w:sz w:val="18"/>
+        </w:rPr>
+        <w:t>recent research including topology-aware EPLB, CRAFT [</w:t>
+      </w:r>
+      <w:hyperlink r:id="rId11" w:history="1">
+        <w:r>
+          <w:rPr>
+            <w:rStyle w:val="Hyperlink"/>
+            <w:rFonts w:ascii="Trebuchet MS" w:hAnsi="Trebuchet MS"/>
+            <w:sz w:val="18"/>
+          </w:rPr>
+          <w:t>1</w:t>
+        </w:r>
+      </w:hyperlink>
+      <w:r>
+        <w:rPr>
+          <w:rFonts w:ascii="Trebuchet MS" w:hAnsi="Trebuchet MS"/>
+          <w:sz w:val="18"/>
+        </w:rPr>
+        <w:t xml:space="preserve">], </w:t>
+      </w:r>
+      <w:proofErr w:type="spellStart"/>
+      <w:r>
+        <w:rPr>
+          <w:rFonts w:ascii="Trebuchet MS" w:hAnsi="Trebuchet MS"/>
+          <w:sz w:val="18"/>
+        </w:rPr>
+        <w:t>MoETuner</w:t>
+      </w:r>
+      <w:proofErr w:type="spellEnd"/>
+      <w:r>
+        <w:rPr>
+          <w:rFonts w:ascii="Trebuchet MS" w:hAnsi="Trebuchet MS"/>
+          <w:sz w:val="18"/>
+        </w:rPr>
+        <w:t xml:space="preserve"> [</w:t>
+      </w:r>
+      <w:hyperlink r:id="rId12" w:history="1">
+        <w:r>
+          <w:rPr>
+            <w:rStyle w:val="Hyperlink"/>
+            <w:rFonts w:ascii="Trebuchet MS" w:hAnsi="Trebuchet MS"/>
+            <w:sz w:val="18"/>
+          </w:rPr>
+          <w:t>2</w:t>
+        </w:r>
+      </w:hyperlink>
+      <w:r>
+        <w:rPr>
+          <w:rFonts w:ascii="Trebuchet MS" w:hAnsi="Trebuchet MS"/>
+          <w:sz w:val="18"/>
+        </w:rPr>
+        <w:t>], Metro [</w:t>
+      </w:r>
+      <w:hyperlink r:id="rId13" w:history="1">
+        <w:r>
+          <w:rPr>
+            <w:rStyle w:val="Hyperlink"/>
+            <w:rFonts w:ascii="Trebuchet MS" w:hAnsi="Trebuchet MS"/>
+            <w:sz w:val="18"/>
+          </w:rPr>
+          <w:t>3</w:t>
+        </w:r>
+      </w:hyperlink>
+      <w:r>
+        <w:rPr>
+          <w:rFonts w:ascii="Trebuchet MS" w:hAnsi="Trebuchet MS"/>
+          <w:sz w:val="18"/>
+        </w:rPr>
+        <w:t>], Libra [</w:t>
+      </w:r>
+      <w:hyperlink r:id="rId14" w:history="1">
+        <w:r>
+          <w:rPr>
+            <w:rStyle w:val="Hyperlink"/>
+            <w:rFonts w:ascii="Trebuchet MS" w:hAnsi="Trebuchet MS"/>
+            <w:sz w:val="18"/>
+          </w:rPr>
+          <w:t>4</w:t>
+        </w:r>
+      </w:hyperlink>
+      <w:r>
+        <w:rPr>
+          <w:rFonts w:ascii="Trebuchet MS" w:hAnsi="Trebuchet MS"/>
+          <w:sz w:val="18"/>
+        </w:rPr>
+        <w:t>], and PROBE [</w:t>
+      </w:r>
+      <w:hyperlink r:id="rId15" w:history="1">
+        <w:r>
+          <w:rPr>
+            <w:rStyle w:val="Hyperlink"/>
+            <w:rFonts w:ascii="Trebuchet MS" w:hAnsi="Trebuchet MS"/>
+            <w:sz w:val="18"/>
+          </w:rPr>
+          <w:t>5</w:t>
+        </w:r>
+      </w:hyperlink>
+      <w:r>
+        <w:rPr>
+          <w:rFonts w:ascii="Trebuchet MS" w:hAnsi="Trebuchet MS"/>
+          <w:sz w:val="18"/>
+        </w:rPr>
+        <w:t>]</w:t>
+      </w:r>
+      <w:r>
+        <w:rPr>
+          <w:rFonts w:ascii="Trebuchet MS" w:hAnsi="Trebuchet MS"/>
+          <w:sz w:val="18"/>
+        </w:rPr>
+        <w:t xml:space="preserve">. </w:t>
+      </w:r>
+      <w:bookmarkEnd w:id="0"/>
+      <w:r>
+        <w:rPr>
+          <w:rFonts w:ascii="Trebuchet MS" w:hAnsi="Trebuchet MS"/>
+          <w:sz w:val="18"/>
+        </w:rPr>
+        <w:t>These systems demonstrate strong individual techniques, but their implementations are tied to specific runtime APIs. This submission focuses on turning those ideas into a framework-neutral load-balancing layer with thin runtime adapters.</w:t>
       </w:r>
     </w:p>
     <w:p>
       <w:pPr>
-        <w:spacing w:after="80" w:before="0" w:line="240" w:lineRule="auto"/>
-        <w:rPr>
-          <w:rFonts w:ascii="Trebuchet MS" w:hAnsi="Trebuchet MS" w:eastAsia="Trebuchet MS" w:cs="Trebuchet MS"/>
+        <w:spacing w:after="80"/>
+        <w:rPr>
+          <w:rFonts w:ascii="Trebuchet MS" w:eastAsia="Trebuchet MS" w:hAnsi="Trebuchet MS" w:cs="Trebuchet MS"/>
           <w:bCs/>
           <w:sz w:val="18"/>
           <w:szCs w:val="18"/>
@@ -234,9 +665,9 @@
     </w:p>
     <w:p>
       <w:pPr>
-        <w:spacing w:after="80" w:before="0" w:line="240" w:lineRule="auto"/>
-        <w:rPr>
-          <w:rFonts w:ascii="Trebuchet MS" w:hAnsi="Trebuchet MS" w:eastAsia="Trebuchet MS" w:cs="Trebuchet MS"/>
+        <w:spacing w:after="80"/>
+        <w:rPr>
+          <w:rFonts w:ascii="Trebuchet MS" w:eastAsia="Trebuchet MS" w:hAnsi="Trebuchet MS" w:cs="Trebuchet MS"/>
           <w:b/>
           <w:sz w:val="18"/>
           <w:szCs w:val="18"/>
@@ -244,9 +675,8 @@
       </w:pPr>
       <w:r>
         <w:rPr>
-          <w:rFonts w:ascii="Trebuchet MS" w:hAnsi="Trebuchet MS" w:eastAsia="Trebuchet MS" w:cs="Trebuchet MS"/>
+          <w:rFonts w:ascii="Trebuchet MS" w:eastAsia="Trebuchet MS" w:hAnsi="Trebuchet MS" w:cs="Trebuchet MS"/>
           <w:b/>
-          <w:i w:val="0"/>
           <w:sz w:val="20"/>
           <w:szCs w:val="18"/>
         </w:rPr>
@@ -255,9 +685,9 @@
     </w:p>
     <w:p>
       <w:pPr>
-        <w:spacing w:after="80" w:before="0" w:line="240" w:lineRule="auto"/>
-        <w:rPr>
-          <w:rFonts w:ascii="Trebuchet MS" w:hAnsi="Trebuchet MS" w:eastAsia="Trebuchet MS" w:cs="Trebuchet MS"/>
+        <w:spacing w:after="80"/>
+        <w:rPr>
+          <w:rFonts w:ascii="Trebuchet MS" w:eastAsia="Trebuchet MS" w:hAnsi="Trebuchet MS" w:cs="Trebuchet MS"/>
           <w:bCs/>
           <w:i/>
           <w:iCs/>
@@ -268,17 +698,188 @@
       <w:r>
         <w:rPr>
           <w:rFonts w:ascii="Trebuchet MS" w:hAnsi="Trebuchet MS"/>
-          <w:i w:val="0"/>
-          <w:sz w:val="18"/>
-        </w:rPr>
-        <w:t>We define a framework-decoupled MoE load balancer with three orthogonal layers. L1 performs static expert placement and replica layout planning. L2 performs per-batch token routing while preserving the router top-k and only changing physical execution choices. L3 reserves a future surface for prediction-driven expert prefetch or runtime migration. The core API uses framework-neutral contracts such as PlacementProvider.snapshot, PlacementPlanner.plan, and TokenRouter.route_tokens, while adapters translate to SGLang, vLLM, or TensorRT-LLM-specific data structures. The SGLang POC integrates L1 EPLB, Waterfill, and LPLB, and validates the adapter boundary end to end.</w:t>
+          <w:sz w:val="18"/>
+        </w:rPr>
+        <w:t xml:space="preserve">We </w:t>
+      </w:r>
+      <w:r>
+        <w:rPr>
+          <w:rFonts w:ascii="Trebuchet MS" w:hAnsi="Trebuchet MS"/>
+          <w:sz w:val="18"/>
+        </w:rPr>
+        <w:t>built</w:t>
+      </w:r>
+      <w:r>
+        <w:rPr>
+          <w:rFonts w:ascii="Trebuchet MS" w:hAnsi="Trebuchet MS"/>
+          <w:sz w:val="18"/>
+        </w:rPr>
+        <w:t xml:space="preserve"> a framework-decoupled </w:t>
+      </w:r>
+      <w:proofErr w:type="spellStart"/>
+      <w:r>
+        <w:rPr>
+          <w:rFonts w:ascii="Trebuchet MS" w:hAnsi="Trebuchet MS"/>
+          <w:sz w:val="18"/>
+        </w:rPr>
+        <w:t>MoE</w:t>
+      </w:r>
+      <w:proofErr w:type="spellEnd"/>
+      <w:r>
+        <w:rPr>
+          <w:rFonts w:ascii="Trebuchet MS" w:hAnsi="Trebuchet MS"/>
+          <w:sz w:val="18"/>
+        </w:rPr>
+        <w:t xml:space="preserve"> load balancer with three orthogonal layers. L1 performs static expert placement and replica layout planning. L2 performs per-batch token routing while preserving the router top-k and only changing physical execution choices. L3 reserves a future surface for prediction-driven expert prefetch or runtime migration. The core API uses framework-neutral contracts such as </w:t>
+      </w:r>
+      <w:proofErr w:type="spellStart"/>
+      <w:r>
+        <w:rPr>
+          <w:rFonts w:ascii="Trebuchet MS" w:hAnsi="Trebuchet MS"/>
+          <w:sz w:val="18"/>
+        </w:rPr>
+        <w:t>PlacementProvider.snapshot</w:t>
+      </w:r>
+      <w:proofErr w:type="spellEnd"/>
+      <w:r>
+        <w:rPr>
+          <w:rFonts w:ascii="Trebuchet MS" w:hAnsi="Trebuchet MS"/>
+          <w:sz w:val="18"/>
+        </w:rPr>
+        <w:t xml:space="preserve">, </w:t>
+      </w:r>
+      <w:proofErr w:type="spellStart"/>
+      <w:r>
+        <w:rPr>
+          <w:rFonts w:ascii="Trebuchet MS" w:hAnsi="Trebuchet MS"/>
+          <w:sz w:val="18"/>
+        </w:rPr>
+        <w:t>PlacementPlanner.plan</w:t>
+      </w:r>
+      <w:proofErr w:type="spellEnd"/>
+      <w:r>
+        <w:rPr>
+          <w:rFonts w:ascii="Trebuchet MS" w:hAnsi="Trebuchet MS"/>
+          <w:sz w:val="18"/>
+        </w:rPr>
+        <w:t xml:space="preserve">, and </w:t>
+      </w:r>
+      <w:proofErr w:type="spellStart"/>
+      <w:r>
+        <w:rPr>
+          <w:rFonts w:ascii="Trebuchet MS" w:hAnsi="Trebuchet MS"/>
+          <w:sz w:val="18"/>
+        </w:rPr>
+        <w:t>TokenRouter.route_tokens</w:t>
+      </w:r>
+      <w:proofErr w:type="spellEnd"/>
+      <w:r>
+        <w:rPr>
+          <w:rFonts w:ascii="Trebuchet MS" w:hAnsi="Trebuchet MS"/>
+          <w:sz w:val="18"/>
+        </w:rPr>
+        <w:t xml:space="preserve">, while adapters translate to </w:t>
+      </w:r>
+      <w:proofErr w:type="spellStart"/>
+      <w:r>
+        <w:rPr>
+          <w:rFonts w:ascii="Trebuchet MS" w:hAnsi="Trebuchet MS"/>
+          <w:sz w:val="18"/>
+        </w:rPr>
+        <w:t>SGLang</w:t>
+      </w:r>
+      <w:proofErr w:type="spellEnd"/>
+      <w:r>
+        <w:rPr>
+          <w:rFonts w:ascii="Trebuchet MS" w:hAnsi="Trebuchet MS"/>
+          <w:sz w:val="18"/>
+        </w:rPr>
+        <w:t xml:space="preserve">, </w:t>
+      </w:r>
+      <w:proofErr w:type="spellStart"/>
+      <w:r>
+        <w:rPr>
+          <w:rFonts w:ascii="Trebuchet MS" w:hAnsi="Trebuchet MS"/>
+          <w:sz w:val="18"/>
+        </w:rPr>
+        <w:t>vLLM</w:t>
+      </w:r>
+      <w:proofErr w:type="spellEnd"/>
+      <w:r>
+        <w:rPr>
+          <w:rFonts w:ascii="Trebuchet MS" w:hAnsi="Trebuchet MS"/>
+          <w:sz w:val="18"/>
+        </w:rPr>
+        <w:t xml:space="preserve">, or </w:t>
+      </w:r>
+      <w:proofErr w:type="spellStart"/>
+      <w:r>
+        <w:rPr>
+          <w:rFonts w:ascii="Trebuchet MS" w:hAnsi="Trebuchet MS"/>
+          <w:sz w:val="18"/>
+        </w:rPr>
+        <w:t>TensorRT</w:t>
+      </w:r>
+      <w:proofErr w:type="spellEnd"/>
+      <w:r>
+        <w:rPr>
+          <w:rFonts w:ascii="Trebuchet MS" w:hAnsi="Trebuchet MS"/>
+          <w:sz w:val="18"/>
+        </w:rPr>
+        <w:t xml:space="preserve">-LLM-specific data structures. The </w:t>
+      </w:r>
+      <w:proofErr w:type="spellStart"/>
+      <w:r>
+        <w:rPr>
+          <w:rFonts w:ascii="Trebuchet MS" w:hAnsi="Trebuchet MS"/>
+          <w:sz w:val="18"/>
+        </w:rPr>
+        <w:t>SGLang</w:t>
+      </w:r>
+      <w:proofErr w:type="spellEnd"/>
+      <w:r>
+        <w:rPr>
+          <w:rFonts w:ascii="Trebuchet MS" w:hAnsi="Trebuchet MS"/>
+          <w:sz w:val="18"/>
+        </w:rPr>
+        <w:t xml:space="preserve"> POC integrates L1 (EPLB) and L2 (</w:t>
+      </w:r>
+      <w:proofErr w:type="spellStart"/>
+      <w:r>
+        <w:rPr>
+          <w:rFonts w:ascii="Trebuchet MS" w:hAnsi="Trebuchet MS"/>
+          <w:sz w:val="18"/>
+        </w:rPr>
+        <w:t>Waterfill</w:t>
+      </w:r>
+      <w:proofErr w:type="spellEnd"/>
+      <w:r>
+        <w:rPr>
+          <w:rFonts w:ascii="Trebuchet MS" w:hAnsi="Trebuchet MS"/>
+          <w:sz w:val="18"/>
+        </w:rPr>
+        <w:t xml:space="preserve"> and LPLB</w:t>
+      </w:r>
+      <w:r>
+        <w:rPr>
+          <w:rFonts w:ascii="Trebuchet MS" w:hAnsi="Trebuchet MS"/>
+          <w:sz w:val="18"/>
+        </w:rPr>
+        <w:t>) and</w:t>
+      </w:r>
+      <w:r>
+        <w:rPr>
+          <w:rFonts w:ascii="Trebuchet MS" w:hAnsi="Trebuchet MS"/>
+          <w:sz w:val="18"/>
+        </w:rPr>
+        <w:t xml:space="preserve"> validates the adapter boundary end to end.</w:t>
       </w:r>
     </w:p>
     <w:p>
       <w:pPr>
-        <w:spacing w:after="80" w:before="0" w:line="240" w:lineRule="auto"/>
-        <w:rPr>
-          <w:rFonts w:ascii="Trebuchet MS" w:hAnsi="Trebuchet MS" w:eastAsia="Trebuchet MS" w:cs="Trebuchet MS"/>
+        <w:spacing w:after="80"/>
+        <w:rPr>
+          <w:rFonts w:ascii="Trebuchet MS" w:eastAsia="Trebuchet MS" w:hAnsi="Trebuchet MS" w:cs="Trebuchet MS"/>
           <w:bCs/>
           <w:sz w:val="18"/>
           <w:szCs w:val="18"/>
@@ -287,9 +888,9 @@
     </w:p>
     <w:p>
       <w:pPr>
-        <w:spacing w:after="80" w:before="0" w:line="240" w:lineRule="auto"/>
-        <w:rPr>
-          <w:rFonts w:ascii="Trebuchet MS" w:hAnsi="Trebuchet MS" w:eastAsia="Trebuchet MS" w:cs="Trebuchet MS"/>
+        <w:spacing w:after="80"/>
+        <w:rPr>
+          <w:rFonts w:ascii="Trebuchet MS" w:eastAsia="Trebuchet MS" w:hAnsi="Trebuchet MS" w:cs="Trebuchet MS"/>
           <w:b/>
           <w:sz w:val="18"/>
           <w:szCs w:val="18"/>
@@ -297,9 +898,8 @@
       </w:pPr>
       <w:r>
         <w:rPr>
-          <w:rFonts w:ascii="Trebuchet MS" w:hAnsi="Trebuchet MS" w:eastAsia="Trebuchet MS" w:cs="Trebuchet MS"/>
+          <w:rFonts w:ascii="Trebuchet MS" w:eastAsia="Trebuchet MS" w:hAnsi="Trebuchet MS" w:cs="Trebuchet MS"/>
           <w:b/>
-          <w:i w:val="0"/>
           <w:sz w:val="20"/>
           <w:szCs w:val="18"/>
         </w:rPr>
@@ -308,31 +908,127 @@
     </w:p>
     <w:p>
       <w:pPr>
-        <w:spacing w:after="80" w:before="0" w:line="240" w:lineRule="auto"/>
-        <w:rPr>
-          <w:rFonts w:ascii="Trebuchet MS" w:hAnsi="Trebuchet MS" w:eastAsia="Trebuchet MS" w:cs="Trebuchet MS"/>
+        <w:spacing w:after="80"/>
+        <w:rPr>
+          <w:rFonts w:ascii="Trebuchet MS" w:eastAsia="Trebuchet MS" w:hAnsi="Trebuchet MS" w:cs="Trebuchet MS"/>
           <w:bCs/>
           <w:sz w:val="18"/>
           <w:szCs w:val="18"/>
+          <w:lang w:eastAsia="zh-CN"/>
         </w:rPr>
       </w:pPr>
       <w:r>
         <w:rPr>
           <w:rFonts w:ascii="Trebuchet MS" w:hAnsi="Trebuchet MS"/>
-          <w:i w:val="0"/>
-          <w:sz w:val="18"/>
-        </w:rPr>
-        <w:t>On two-node H20 DeepSeek-V3/R1-style serving workloads, the latest SGLang/DeepEP measurements show Waterfill improving total throughput by +1.48% to +4.66% across MMLU, GPQA, and GSM8K. LPLB improves redundant-EPLB configurations by up to +7.34%, with the strongest result on GSM8K red32. On DeepSeek V4 Flash, Waterfill improves the best measured point from 49,253 tok/s to 51,677 tok/s (+4.92%). These gains preserve model semantics because the router top-k is unchanged; only the physical shared-expert rank or valid routed-expert replica is selected differently.</w:t>
+          <w:sz w:val="18"/>
+        </w:rPr>
+        <w:t xml:space="preserve">On two-node H20 DeepSeek-V3/R1-style serving workloads, the latest </w:t>
+      </w:r>
+      <w:proofErr w:type="spellStart"/>
+      <w:r>
+        <w:rPr>
+          <w:rFonts w:ascii="Trebuchet MS" w:hAnsi="Trebuchet MS"/>
+          <w:sz w:val="18"/>
+        </w:rPr>
+        <w:t>SGLang</w:t>
+      </w:r>
+      <w:proofErr w:type="spellEnd"/>
+      <w:r>
+        <w:rPr>
+          <w:rFonts w:ascii="Trebuchet MS" w:hAnsi="Trebuchet MS"/>
+          <w:sz w:val="18"/>
+        </w:rPr>
+        <w:t>/</w:t>
+      </w:r>
+      <w:proofErr w:type="spellStart"/>
+      <w:r>
+        <w:rPr>
+          <w:rFonts w:ascii="Trebuchet MS" w:hAnsi="Trebuchet MS"/>
+          <w:sz w:val="18"/>
+        </w:rPr>
+        <w:t>DeepEP</w:t>
+      </w:r>
+      <w:proofErr w:type="spellEnd"/>
+      <w:r>
+        <w:rPr>
+          <w:rFonts w:ascii="Trebuchet MS" w:hAnsi="Trebuchet MS"/>
+          <w:sz w:val="18"/>
+        </w:rPr>
+        <w:t xml:space="preserve"> measurements show </w:t>
+      </w:r>
+      <w:proofErr w:type="spellStart"/>
+      <w:r>
+        <w:rPr>
+          <w:rFonts w:ascii="Trebuchet MS" w:hAnsi="Trebuchet MS"/>
+          <w:sz w:val="18"/>
+        </w:rPr>
+        <w:t>Waterfill</w:t>
+      </w:r>
+      <w:proofErr w:type="spellEnd"/>
+      <w:r>
+        <w:rPr>
+          <w:rFonts w:ascii="Trebuchet MS" w:hAnsi="Trebuchet MS"/>
+          <w:sz w:val="18"/>
+        </w:rPr>
+        <w:t xml:space="preserve"> improving total throughput by +1.48% to +4.66% across MMLU, GPQA, and GSM8K. LPLB improves redundant-EPLB configurations by up to +7.34%, with the strongest result on GSM8K red32. On DeepSeek V4 Flash, </w:t>
+      </w:r>
+      <w:proofErr w:type="spellStart"/>
+      <w:r>
+        <w:rPr>
+          <w:rFonts w:ascii="Trebuchet MS" w:hAnsi="Trebuchet MS"/>
+          <w:sz w:val="18"/>
+        </w:rPr>
+        <w:t>Waterfill</w:t>
+      </w:r>
+      <w:proofErr w:type="spellEnd"/>
+      <w:r>
+        <w:rPr>
+          <w:rFonts w:ascii="Trebuchet MS" w:hAnsi="Trebuchet MS"/>
+          <w:sz w:val="18"/>
+        </w:rPr>
+        <w:t xml:space="preserve"> improves the best measured point from 49,253 </w:t>
+      </w:r>
+      <w:proofErr w:type="spellStart"/>
+      <w:r>
+        <w:rPr>
+          <w:rFonts w:ascii="Trebuchet MS" w:hAnsi="Trebuchet MS"/>
+          <w:sz w:val="18"/>
+        </w:rPr>
+        <w:t>tok</w:t>
+      </w:r>
+      <w:proofErr w:type="spellEnd"/>
+      <w:r>
+        <w:rPr>
+          <w:rFonts w:ascii="Trebuchet MS" w:hAnsi="Trebuchet MS"/>
+          <w:sz w:val="18"/>
+        </w:rPr>
+        <w:t xml:space="preserve">/s to 51,677 </w:t>
+      </w:r>
+      <w:proofErr w:type="spellStart"/>
+      <w:r>
+        <w:rPr>
+          <w:rFonts w:ascii="Trebuchet MS" w:hAnsi="Trebuchet MS"/>
+          <w:sz w:val="18"/>
+        </w:rPr>
+        <w:t>tok</w:t>
+      </w:r>
+      <w:proofErr w:type="spellEnd"/>
+      <w:r>
+        <w:rPr>
+          <w:rFonts w:ascii="Trebuchet MS" w:hAnsi="Trebuchet MS"/>
+          <w:sz w:val="18"/>
+        </w:rPr>
+        <w:t>/s (+4.92%). These gains preserve model semantics because the router top-k is unchanged; only the physical shared-expert rank or valid routed-expert replica is selected differently.</w:t>
       </w:r>
     </w:p>
     <w:sectPr>
-      <w:headerReference w:type="even" r:id="rId11"/>
-      <w:headerReference w:type="default" r:id="rId12"/>
-      <w:footerReference w:type="even" r:id="rId13"/>
-      <w:footerReference w:type="default" r:id="rId14"/>
-      <w:headerReference w:type="first" r:id="rId15"/>
-      <w:footerReference w:type="first" r:id="rId16"/>
-      <w:pgSz w:w="12240" w:h="15840" w:orient="portrait"/>
+      <w:headerReference w:type="even" r:id="rId16"/>
+      <w:headerReference w:type="default" r:id="rId17"/>
+      <w:footerReference w:type="even" r:id="rId18"/>
+      <w:footerReference w:type="default" r:id="rId19"/>
+      <w:headerReference w:type="first" r:id="rId20"/>
+      <w:footerReference w:type="first" r:id="rId21"/>
+      <w:pgSz w:w="12240" w:h="15840"/>
       <w:pgMar w:top="1356" w:right="1170" w:bottom="990" w:left="1440" w:header="720" w:footer="720" w:gutter="0"/>
       <w:pgNumType w:start="1"/>
       <w:cols w:space="720"/>
@@ -497,7 +1193,7 @@
       </w:pBdr>
       <w:spacing w:line="276" w:lineRule="auto"/>
       <w:rPr>
-        <w:rFonts w:ascii="Trebuchet MS" w:hAnsi="Trebuchet MS" w:eastAsia="Trebuchet MS" w:cs="Trebuchet MS"/>
+        <w:rFonts w:ascii="Trebuchet MS" w:eastAsia="Trebuchet MS" w:hAnsi="Trebuchet MS" w:cs="Trebuchet MS"/>
         <w:sz w:val="18"/>
         <w:szCs w:val="18"/>
       </w:rPr>
@@ -507,8 +1203,8 @@
     <w:tblPr>
       <w:tblW w:w="9630" w:type="dxa"/>
       <w:tblBorders>
-        <w:bottom w:val="single" w:color="808080" w:sz="18" w:space="0"/>
-        <w:insideV w:val="single" w:color="808080" w:sz="18" w:space="0"/>
+        <w:bottom w:val="single" w:sz="18" w:space="0" w:color="808080"/>
+        <w:insideV w:val="single" w:sz="18" w:space="0" w:color="808080"/>
       </w:tblBorders>
       <w:tblLayout w:type="fixed"/>
       <w:tblCellMar>
@@ -530,7 +1226,6 @@
       <w:tc>
         <w:tcPr>
           <w:tcW w:w="8430" w:type="dxa"/>
-          <w:tcMar/>
         </w:tcPr>
         <w:p>
           <w:pPr>
@@ -556,7 +1251,7 @@
           </w:pPr>
           <w:r>
             <w:rPr>
-              <w:rFonts w:ascii="Trebuchet MS" w:hAnsi="Trebuchet MS" w:eastAsia="Trebuchet MS" w:cs="Trebuchet MS"/>
+              <w:rFonts w:ascii="Trebuchet MS" w:eastAsia="Trebuchet MS" w:hAnsi="Trebuchet MS" w:cs="Trebuchet MS"/>
               <w:color w:val="404040"/>
               <w:sz w:val="40"/>
               <w:szCs w:val="40"/>
@@ -565,7 +1260,7 @@
           </w:r>
           <w:r>
             <w:rPr>
-              <w:rFonts w:hint="eastAsia" w:ascii="Trebuchet MS" w:hAnsi="Trebuchet MS" w:cs="Trebuchet MS"/>
+              <w:rFonts w:ascii="Trebuchet MS" w:hAnsi="Trebuchet MS" w:cs="Trebuchet MS" w:hint="eastAsia"/>
               <w:color w:val="404040"/>
               <w:sz w:val="40"/>
               <w:szCs w:val="40"/>
@@ -578,25 +1273,24 @@
       <w:tc>
         <w:tcPr>
           <w:tcW w:w="1200" w:type="dxa"/>
-          <w:tcMar/>
         </w:tcPr>
         <w:p>
           <w:pPr>
             <w:pBdr>
-              <w:top w:val="nil" w:color="FF000000" w:sz="0" w:space="0"/>
-              <w:left w:val="nil" w:color="FF000000" w:sz="0" w:space="0"/>
-              <w:bottom w:val="nil" w:color="FF000000" w:sz="0" w:space="0"/>
-              <w:right w:val="nil" w:color="FF000000" w:sz="0" w:space="0"/>
-              <w:between w:val="nil" w:color="FF000000" w:sz="0" w:space="0"/>
+              <w:top w:val="nil"/>
+              <w:left w:val="nil"/>
+              <w:bottom w:val="nil"/>
+              <w:right w:val="nil"/>
+              <w:between w:val="nil"/>
             </w:pBdr>
             <w:tabs>
               <w:tab w:val="center" w:pos="4680"/>
               <w:tab w:val="right" w:pos="9360"/>
             </w:tabs>
             <w:rPr>
-              <w:rFonts w:ascii="Trebuchet MS" w:hAnsi="Trebuchet MS" w:eastAsia="Trebuchet MS" w:cs="Trebuchet MS"/>
-              <w:b w:val="1"/>
-              <w:bCs w:val="1"/>
+              <w:rFonts w:ascii="Trebuchet MS" w:eastAsia="Trebuchet MS" w:hAnsi="Trebuchet MS" w:cs="Trebuchet MS"/>
+              <w:b/>
+              <w:bCs/>
               <w:color w:val="76B900"/>
               <w:sz w:val="40"/>
               <w:szCs w:val="40"/>
@@ -604,25 +1298,14 @@
           </w:pPr>
           <w:r>
             <w:rPr>
-              <w:rFonts w:ascii="Trebuchet MS" w:hAnsi="Trebuchet MS" w:eastAsia="Trebuchet MS" w:cs="Trebuchet MS"/>
-              <w:b w:val="1"/>
-              <w:bCs w:val="1"/>
+              <w:rFonts w:ascii="Trebuchet MS" w:eastAsia="Trebuchet MS" w:hAnsi="Trebuchet MS" w:cs="Trebuchet MS"/>
+              <w:b/>
+              <w:bCs/>
               <w:color w:val="76B900"/>
               <w:sz w:val="40"/>
               <w:szCs w:val="40"/>
             </w:rPr>
-            <w:t>202</w:t>
-          </w:r>
-          <w:r>
-            <w:rPr>
-              <w:rFonts w:ascii="Trebuchet MS" w:hAnsi="Trebuchet MS" w:eastAsia="Trebuchet MS" w:cs="Trebuchet MS"/>
-              <w:b w:val="1"/>
-              <w:bCs w:val="1"/>
-              <w:color w:val="76B900"/>
-              <w:sz w:val="40"/>
-              <w:szCs w:val="40"/>
-            </w:rPr>
-            <w:t>6</w:t>
+            <w:t>2026</w:t>
           </w:r>
         </w:p>
       </w:tc>
@@ -698,7 +1381,7 @@
         <w:ind w:left="720" w:hanging="360"/>
       </w:pPr>
       <w:rPr>
-        <w:rFonts w:ascii="Noto Sans Symbols" w:hAnsi="Noto Sans Symbols" w:eastAsia="Noto Sans Symbols" w:cs="Noto Sans Symbols"/>
+        <w:rFonts w:ascii="Noto Sans Symbols" w:eastAsia="Noto Sans Symbols" w:hAnsi="Noto Sans Symbols" w:cs="Noto Sans Symbols"/>
       </w:rPr>
     </w:lvl>
     <w:lvl w:ilvl="1">
@@ -710,7 +1393,7 @@
         <w:ind w:left="1440" w:hanging="360"/>
       </w:pPr>
       <w:rPr>
-        <w:rFonts w:ascii="Courier New" w:hAnsi="Courier New" w:eastAsia="Courier New" w:cs="Courier New"/>
+        <w:rFonts w:ascii="Courier New" w:eastAsia="Courier New" w:hAnsi="Courier New" w:cs="Courier New"/>
       </w:rPr>
     </w:lvl>
     <w:lvl w:ilvl="2">
@@ -722,7 +1405,7 @@
         <w:ind w:left="2160" w:hanging="360"/>
       </w:pPr>
       <w:rPr>
-        <w:rFonts w:ascii="Noto Sans Symbols" w:hAnsi="Noto Sans Symbols" w:eastAsia="Noto Sans Symbols" w:cs="Noto Sans Symbols"/>
+        <w:rFonts w:ascii="Noto Sans Symbols" w:eastAsia="Noto Sans Symbols" w:hAnsi="Noto Sans Symbols" w:cs="Noto Sans Symbols"/>
       </w:rPr>
     </w:lvl>
     <w:lvl w:ilvl="3">
@@ -734,7 +1417,7 @@
         <w:ind w:left="2880" w:hanging="360"/>
       </w:pPr>
       <w:rPr>
-        <w:rFonts w:ascii="Noto Sans Symbols" w:hAnsi="Noto Sans Symbols" w:eastAsia="Noto Sans Symbols" w:cs="Noto Sans Symbols"/>
+        <w:rFonts w:ascii="Noto Sans Symbols" w:eastAsia="Noto Sans Symbols" w:hAnsi="Noto Sans Symbols" w:cs="Noto Sans Symbols"/>
       </w:rPr>
     </w:lvl>
     <w:lvl w:ilvl="4">
@@ -746,7 +1429,7 @@
         <w:ind w:left="3600" w:hanging="360"/>
       </w:pPr>
       <w:rPr>
-        <w:rFonts w:ascii="Courier New" w:hAnsi="Courier New" w:eastAsia="Courier New" w:cs="Courier New"/>
+        <w:rFonts w:ascii="Courier New" w:eastAsia="Courier New" w:hAnsi="Courier New" w:cs="Courier New"/>
       </w:rPr>
     </w:lvl>
     <w:lvl w:ilvl="5">
@@ -758,7 +1441,7 @@
         <w:ind w:left="4320" w:hanging="360"/>
       </w:pPr>
       <w:rPr>
-        <w:rFonts w:ascii="Noto Sans Symbols" w:hAnsi="Noto Sans Symbols" w:eastAsia="Noto Sans Symbols" w:cs="Noto Sans Symbols"/>
+        <w:rFonts w:ascii="Noto Sans Symbols" w:eastAsia="Noto Sans Symbols" w:hAnsi="Noto Sans Symbols" w:cs="Noto Sans Symbols"/>
       </w:rPr>
     </w:lvl>
     <w:lvl w:ilvl="6">
@@ -770,7 +1453,7 @@
         <w:ind w:left="5040" w:hanging="360"/>
       </w:pPr>
       <w:rPr>
-        <w:rFonts w:ascii="Noto Sans Symbols" w:hAnsi="Noto Sans Symbols" w:eastAsia="Noto Sans Symbols" w:cs="Noto Sans Symbols"/>
+        <w:rFonts w:ascii="Noto Sans Symbols" w:eastAsia="Noto Sans Symbols" w:hAnsi="Noto Sans Symbols" w:cs="Noto Sans Symbols"/>
       </w:rPr>
     </w:lvl>
     <w:lvl w:ilvl="7">
@@ -782,7 +1465,7 @@
         <w:ind w:left="5760" w:hanging="360"/>
       </w:pPr>
       <w:rPr>
-        <w:rFonts w:ascii="Courier New" w:hAnsi="Courier New" w:eastAsia="Courier New" w:cs="Courier New"/>
+        <w:rFonts w:ascii="Courier New" w:eastAsia="Courier New" w:hAnsi="Courier New" w:cs="Courier New"/>
       </w:rPr>
     </w:lvl>
     <w:lvl w:ilvl="8">
@@ -794,7 +1477,7 @@
         <w:ind w:left="6480" w:hanging="360"/>
       </w:pPr>
       <w:rPr>
-        <w:rFonts w:ascii="Noto Sans Symbols" w:hAnsi="Noto Sans Symbols" w:eastAsia="Noto Sans Symbols" w:cs="Noto Sans Symbols"/>
+        <w:rFonts w:ascii="Noto Sans Symbols" w:eastAsia="Noto Sans Symbols" w:hAnsi="Noto Sans Symbols" w:cs="Noto Sans Symbols"/>
       </w:rPr>
     </w:lvl>
   </w:abstractNum>
@@ -809,7 +1492,7 @@
   <w:docDefaults>
     <w:rPrDefault>
       <w:rPr>
-        <w:rFonts w:ascii="Calibri" w:hAnsi="Calibri" w:cs="Calibri" w:eastAsiaTheme="minorEastAsia"/>
+        <w:rFonts w:ascii="Calibri" w:eastAsiaTheme="minorEastAsia" w:hAnsi="Calibri" w:cs="Calibri"/>
         <w:sz w:val="22"/>
         <w:szCs w:val="22"/>
         <w:lang w:val="en-US" w:eastAsia="en-US" w:bidi="ar-SA"/>
@@ -820,14 +1503,14 @@
   <w:latentStyles w:defLockedState="0" w:defUIPriority="99" w:defSemiHidden="0" w:defUnhideWhenUsed="0" w:defQFormat="0" w:count="376">
     <w:lsdException w:name="Normal" w:uiPriority="0" w:qFormat="1"/>
     <w:lsdException w:name="heading 1" w:uiPriority="9" w:qFormat="1"/>
-    <w:lsdException w:name="heading 2" w:uiPriority="9" w:semiHidden="1" w:unhideWhenUsed="1" w:qFormat="1"/>
-    <w:lsdException w:name="heading 3" w:uiPriority="9" w:semiHidden="1" w:unhideWhenUsed="1" w:qFormat="1"/>
-    <w:lsdException w:name="heading 4" w:uiPriority="9" w:semiHidden="1" w:unhideWhenUsed="1" w:qFormat="1"/>
-    <w:lsdException w:name="heading 5" w:uiPriority="9" w:semiHidden="1" w:unhideWhenUsed="1" w:qFormat="1"/>
-    <w:lsdException w:name="heading 6" w:uiPriority="9" w:semiHidden="1" w:unhideWhenUsed="1" w:qFormat="1"/>
-    <w:lsdException w:name="heading 7" w:uiPriority="9" w:semiHidden="1" w:unhideWhenUsed="1" w:qFormat="1"/>
-    <w:lsdException w:name="heading 8" w:uiPriority="9" w:semiHidden="1" w:unhideWhenUsed="1" w:qFormat="1"/>
-    <w:lsdException w:name="heading 9" w:uiPriority="9" w:semiHidden="1" w:unhideWhenUsed="1" w:qFormat="1"/>
+    <w:lsdException w:name="heading 2" w:semiHidden="1" w:uiPriority="9" w:unhideWhenUsed="1" w:qFormat="1"/>
+    <w:lsdException w:name="heading 3" w:semiHidden="1" w:uiPriority="9" w:unhideWhenUsed="1" w:qFormat="1"/>
+    <w:lsdException w:name="heading 4" w:semiHidden="1" w:uiPriority="9" w:unhideWhenUsed="1" w:qFormat="1"/>
+    <w:lsdException w:name="heading 5" w:semiHidden="1" w:uiPriority="9" w:unhideWhenUsed="1" w:qFormat="1"/>
+    <w:lsdException w:name="heading 6" w:semiHidden="1" w:uiPriority="9" w:unhideWhenUsed="1" w:qFormat="1"/>
+    <w:lsdException w:name="heading 7" w:semiHidden="1" w:uiPriority="9" w:unhideWhenUsed="1" w:qFormat="1"/>
+    <w:lsdException w:name="heading 8" w:semiHidden="1" w:uiPriority="9" w:unhideWhenUsed="1" w:qFormat="1"/>
+    <w:lsdException w:name="heading 9" w:semiHidden="1" w:uiPriority="9" w:unhideWhenUsed="1" w:qFormat="1"/>
     <w:lsdException w:name="index 1" w:semiHidden="1" w:unhideWhenUsed="1"/>
     <w:lsdException w:name="index 2" w:semiHidden="1" w:unhideWhenUsed="1"/>
     <w:lsdException w:name="index 3" w:semiHidden="1" w:unhideWhenUsed="1"/>
@@ -837,22 +1520,22 @@
     <w:lsdException w:name="index 7" w:semiHidden="1" w:unhideWhenUsed="1"/>
     <w:lsdException w:name="index 8" w:semiHidden="1" w:unhideWhenUsed="1"/>
     <w:lsdException w:name="index 9" w:semiHidden="1" w:unhideWhenUsed="1"/>
-    <w:lsdException w:name="toc 1" w:uiPriority="39" w:semiHidden="1" w:unhideWhenUsed="1"/>
-    <w:lsdException w:name="toc 2" w:uiPriority="39" w:semiHidden="1" w:unhideWhenUsed="1"/>
-    <w:lsdException w:name="toc 3" w:uiPriority="39" w:semiHidden="1" w:unhideWhenUsed="1"/>
-    <w:lsdException w:name="toc 4" w:uiPriority="39" w:semiHidden="1" w:unhideWhenUsed="1"/>
-    <w:lsdException w:name="toc 5" w:uiPriority="39" w:semiHidden="1" w:unhideWhenUsed="1"/>
-    <w:lsdException w:name="toc 6" w:uiPriority="39" w:semiHidden="1" w:unhideWhenUsed="1"/>
-    <w:lsdException w:name="toc 7" w:uiPriority="39" w:semiHidden="1" w:unhideWhenUsed="1"/>
-    <w:lsdException w:name="toc 8" w:uiPriority="39" w:semiHidden="1" w:unhideWhenUsed="1"/>
-    <w:lsdException w:name="toc 9" w:uiPriority="39" w:semiHidden="1" w:unhideWhenUsed="1"/>
+    <w:lsdException w:name="toc 1" w:semiHidden="1" w:uiPriority="39" w:unhideWhenUsed="1"/>
+    <w:lsdException w:name="toc 2" w:semiHidden="1" w:uiPriority="39" w:unhideWhenUsed="1"/>
+    <w:lsdException w:name="toc 3" w:semiHidden="1" w:uiPriority="39" w:unhideWhenUsed="1"/>
+    <w:lsdException w:name="toc 4" w:semiHidden="1" w:uiPriority="39" w:unhideWhenUsed="1"/>
+    <w:lsdException w:name="toc 5" w:semiHidden="1" w:uiPriority="39" w:unhideWhenUsed="1"/>
+    <w:lsdException w:name="toc 6" w:semiHidden="1" w:uiPriority="39" w:unhideWhenUsed="1"/>
+    <w:lsdException w:name="toc 7" w:semiHidden="1" w:uiPriority="39" w:unhideWhenUsed="1"/>
+    <w:lsdException w:name="toc 8" w:semiHidden="1" w:uiPriority="39" w:unhideWhenUsed="1"/>
+    <w:lsdException w:name="toc 9" w:semiHidden="1" w:uiPriority="39" w:unhideWhenUsed="1"/>
     <w:lsdException w:name="Normal Indent" w:semiHidden="1" w:unhideWhenUsed="1"/>
     <w:lsdException w:name="footnote text" w:semiHidden="1" w:unhideWhenUsed="1"/>
     <w:lsdException w:name="annotation text" w:semiHidden="1" w:unhideWhenUsed="1"/>
     <w:lsdException w:name="header" w:semiHidden="1" w:unhideWhenUsed="1"/>
     <w:lsdException w:name="footer" w:semiHidden="1" w:unhideWhenUsed="1"/>
     <w:lsdException w:name="index heading" w:semiHidden="1" w:unhideWhenUsed="1"/>
-    <w:lsdException w:name="caption" w:uiPriority="35" w:semiHidden="1" w:unhideWhenUsed="1" w:qFormat="1"/>
+    <w:lsdException w:name="caption" w:semiHidden="1" w:uiPriority="35" w:unhideWhenUsed="1" w:qFormat="1"/>
     <w:lsdException w:name="table of figures" w:semiHidden="1" w:unhideWhenUsed="1"/>
     <w:lsdException w:name="envelope address" w:semiHidden="1" w:unhideWhenUsed="1"/>
     <w:lsdException w:name="envelope return" w:semiHidden="1" w:unhideWhenUsed="1"/>
@@ -883,7 +1566,7 @@
     <w:lsdException w:name="Title" w:uiPriority="10" w:qFormat="1"/>
     <w:lsdException w:name="Closing" w:semiHidden="1" w:unhideWhenUsed="1"/>
     <w:lsdException w:name="Signature" w:semiHidden="1" w:unhideWhenUsed="1"/>
-    <w:lsdException w:name="Default Paragraph Font" w:uiPriority="1" w:semiHidden="1" w:unhideWhenUsed="1"/>
+    <w:lsdException w:name="Default Paragraph Font" w:semiHidden="1" w:uiPriority="1" w:unhideWhenUsed="1"/>
     <w:lsdException w:name="Body Text" w:semiHidden="1" w:unhideWhenUsed="1"/>
     <w:lsdException w:name="Body Text Indent" w:semiHidden="1" w:unhideWhenUsed="1"/>
     <w:lsdException w:name="List Continue" w:semiHidden="1" w:unhideWhenUsed="1"/>
@@ -1083,8 +1766,8 @@
     <w:lsdException w:name="Subtle Reference" w:uiPriority="31" w:qFormat="1"/>
     <w:lsdException w:name="Intense Reference" w:uiPriority="32" w:qFormat="1"/>
     <w:lsdException w:name="Book Title" w:uiPriority="33" w:qFormat="1"/>
-    <w:lsdException w:name="Bibliography" w:uiPriority="37" w:semiHidden="1" w:unhideWhenUsed="1"/>
-    <w:lsdException w:name="TOC Heading" w:uiPriority="39" w:semiHidden="1" w:unhideWhenUsed="1" w:qFormat="1"/>
+    <w:lsdException w:name="Bibliography" w:semiHidden="1" w:uiPriority="37" w:unhideWhenUsed="1"/>
+    <w:lsdException w:name="TOC Heading" w:semiHidden="1" w:uiPriority="39" w:unhideWhenUsed="1" w:qFormat="1"/>
     <w:lsdException w:name="Plain Table 1" w:uiPriority="41"/>
     <w:lsdException w:name="Plain Table 2" w:uiPriority="42"/>
     <w:lsdException w:name="Plain Table 3" w:uiPriority="43"/>
@@ -1195,7 +1878,7 @@
     <w:lsdException w:name="Unresolved Mention" w:semiHidden="1" w:unhideWhenUsed="1"/>
     <w:lsdException w:name="Smart Link" w:semiHidden="1" w:unhideWhenUsed="1"/>
   </w:latentStyles>
-  <w:style w:type="paragraph" w:styleId="Normal" w:default="1">
+  <w:style w:type="paragraph" w:default="1" w:styleId="Normal">
     <w:name w:val="Normal"/>
     <w:qFormat/>
     <w:rsid w:val="00CF0B2A"/>
@@ -1316,13 +1999,13 @@
       <w:szCs w:val="20"/>
     </w:rPr>
   </w:style>
-  <w:style w:type="character" w:styleId="DefaultParagraphFont" w:default="1">
+  <w:style w:type="character" w:default="1" w:styleId="DefaultParagraphFont">
     <w:name w:val="Default Paragraph Font"/>
     <w:uiPriority w:val="1"/>
     <w:semiHidden/>
     <w:unhideWhenUsed/>
   </w:style>
-  <w:style w:type="table" w:styleId="TableNormal" w:default="1">
+  <w:style w:type="table" w:default="1" w:styleId="TableNormal">
     <w:name w:val="Normal Table"/>
     <w:uiPriority w:val="99"/>
     <w:semiHidden/>
@@ -1337,7 +2020,7 @@
       </w:tblCellMar>
     </w:tblPr>
   </w:style>
-  <w:style w:type="numbering" w:styleId="NoList" w:default="1">
+  <w:style w:type="numbering" w:default="1" w:styleId="NoList">
     <w:name w:val="No List"/>
     <w:uiPriority w:val="99"/>
     <w:semiHidden/>
@@ -1374,14 +2057,14 @@
       </w:tabs>
     </w:pPr>
   </w:style>
-  <w:style w:type="character" w:styleId="HeaderChar" w:customStyle="1">
+  <w:style w:type="character" w:customStyle="1" w:styleId="HeaderChar">
     <w:name w:val="Header Char"/>
     <w:basedOn w:val="DefaultParagraphFont"/>
     <w:link w:val="Header"/>
     <w:uiPriority w:val="99"/>
     <w:rsid w:val="00CF0B2A"/>
     <w:rPr>
-      <w:rFonts w:ascii="Calibri" w:hAnsi="Calibri" w:eastAsia="Calibri" w:cs="Calibri"/>
+      <w:rFonts w:ascii="Calibri" w:eastAsia="Calibri" w:hAnsi="Calibri" w:cs="Calibri"/>
     </w:rPr>
   </w:style>
   <w:style w:type="paragraph" w:styleId="Footer">
@@ -1398,14 +2081,14 @@
       </w:tabs>
     </w:pPr>
   </w:style>
-  <w:style w:type="character" w:styleId="FooterChar" w:customStyle="1">
+  <w:style w:type="character" w:customStyle="1" w:styleId="FooterChar">
     <w:name w:val="Footer Char"/>
     <w:basedOn w:val="DefaultParagraphFont"/>
     <w:link w:val="Footer"/>
     <w:uiPriority w:val="99"/>
     <w:rsid w:val="00CF0B2A"/>
     <w:rPr>
-      <w:rFonts w:ascii="Calibri" w:hAnsi="Calibri" w:eastAsia="Calibri" w:cs="Calibri"/>
+      <w:rFonts w:ascii="Calibri" w:eastAsia="Calibri" w:hAnsi="Calibri" w:cs="Calibri"/>
     </w:rPr>
   </w:style>
   <w:style w:type="paragraph" w:styleId="BalloonText">
@@ -1422,7 +2105,7 @@
       <w:szCs w:val="16"/>
     </w:rPr>
   </w:style>
-  <w:style w:type="character" w:styleId="BalloonTextChar" w:customStyle="1">
+  <w:style w:type="character" w:customStyle="1" w:styleId="BalloonTextChar">
     <w:name w:val="Balloon Text Char"/>
     <w:basedOn w:val="DefaultParagraphFont"/>
     <w:link w:val="BalloonText"/>
@@ -1430,7 +2113,7 @@
     <w:semiHidden/>
     <w:rsid w:val="00CF0B2A"/>
     <w:rPr>
-      <w:rFonts w:ascii="Tahoma" w:hAnsi="Tahoma" w:eastAsia="Calibri" w:cs="Tahoma"/>
+      <w:rFonts w:ascii="Tahoma" w:eastAsia="Calibri" w:hAnsi="Tahoma" w:cs="Tahoma"/>
       <w:sz w:val="16"/>
       <w:szCs w:val="16"/>
     </w:rPr>
@@ -1457,7 +2140,7 @@
       <w:u w:val="single"/>
     </w:rPr>
   </w:style>
-  <w:style w:type="paragraph" w:styleId="Default" w:customStyle="1">
+  <w:style w:type="paragraph" w:customStyle="1" w:styleId="Default">
     <w:name w:val="Default"/>
     <w:rsid w:val="005B745A"/>
     <w:pPr>
@@ -1484,14 +2167,14 @@
       <w:spacing w:before="360" w:after="80"/>
     </w:pPr>
     <w:rPr>
-      <w:rFonts w:ascii="Georgia" w:hAnsi="Georgia" w:eastAsia="Georgia" w:cs="Georgia"/>
+      <w:rFonts w:ascii="Georgia" w:eastAsia="Georgia" w:hAnsi="Georgia" w:cs="Georgia"/>
       <w:i/>
       <w:color w:val="666666"/>
       <w:sz w:val="48"/>
       <w:szCs w:val="48"/>
     </w:rPr>
   </w:style>
-  <w:style w:type="table" w:styleId="a" w:customStyle="1">
+  <w:style w:type="table" w:customStyle="1" w:styleId="a">
     <w:basedOn w:val="TableNormal"/>
     <w:tblPr>
       <w:tblStyleRowBandSize w:val="1"/>
@@ -1511,14 +2194,26 @@
     <w:rsid w:val="00FB4123"/>
     <w:tblPr>
       <w:tblBorders>
-        <w:top w:val="single" w:color="000000" w:themeColor="text1" w:sz="4" w:space="0"/>
-        <w:left w:val="single" w:color="000000" w:themeColor="text1" w:sz="4" w:space="0"/>
-        <w:bottom w:val="single" w:color="000000" w:themeColor="text1" w:sz="4" w:space="0"/>
-        <w:right w:val="single" w:color="000000" w:themeColor="text1" w:sz="4" w:space="0"/>
-        <w:insideH w:val="single" w:color="000000" w:themeColor="text1" w:sz="4" w:space="0"/>
-        <w:insideV w:val="single" w:color="000000" w:themeColor="text1" w:sz="4" w:space="0"/>
+        <w:top w:val="single" w:sz="4" w:space="0" w:color="000000" w:themeColor="text1"/>
+        <w:left w:val="single" w:sz="4" w:space="0" w:color="000000" w:themeColor="text1"/>
+        <w:bottom w:val="single" w:sz="4" w:space="0" w:color="000000" w:themeColor="text1"/>
+        <w:right w:val="single" w:sz="4" w:space="0" w:color="000000" w:themeColor="text1"/>
+        <w:insideH w:val="single" w:sz="4" w:space="0" w:color="000000" w:themeColor="text1"/>
+        <w:insideV w:val="single" w:sz="4" w:space="0" w:color="000000" w:themeColor="text1"/>
       </w:tblBorders>
     </w:tblPr>
+  </w:style>
+  <w:style w:type="character" w:styleId="UnresolvedMention">
+    <w:name w:val="Unresolved Mention"/>
+    <w:basedOn w:val="DefaultParagraphFont"/>
+    <w:uiPriority w:val="99"/>
+    <w:semiHidden/>
+    <w:unhideWhenUsed/>
+    <w:rsid w:val="008E6BCF"/>
+    <w:rPr>
+      <w:color w:val="605E5C"/>
+      <w:shd w:val="clear" w:color="auto" w:fill="E1DFDD"/>
+    </w:rPr>
   </w:style>
 </w:styles>
 </file>
@@ -1809,6 +2504,28 @@
 </file>
 
 <file path=customXml/item1.xml><?xml version="1.0" encoding="utf-8"?>
+<?mso-contentType ?>
+<FormTemplates xmlns="http://schemas.microsoft.com/sharepoint/v3/contenttype/forms">
+  <Display>DocumentLibraryForm</Display>
+  <Edit>DocumentLibraryForm</Edit>
+  <New>DocumentLibraryForm</New>
+</FormTemplates>
+</file>
+
+<file path=customXml/item2.xml><?xml version="1.0" encoding="utf-8"?>
+<p:properties xmlns:p="http://schemas.microsoft.com/office/2006/metadata/properties" xmlns:xsi="http://www.w3.org/2001/XMLSchema-instance" xmlns:pc="http://schemas.microsoft.com/office/infopath/2007/PartnerControls">
+  <documentManagement>
+    <TaxCatchAll xmlns="f65afe6d-7162-4df4-ae98-80745cab72d4" xsi:nil="true"/>
+    <lcf76f155ced4ddcb4097134ff3c332f xmlns="dd2a4ee4-6b09-42b9-9a64-8c33b4bfb8dd">
+      <Terms xmlns="http://schemas.microsoft.com/office/infopath/2007/PartnerControls"/>
+    </lcf76f155ced4ddcb4097134ff3c332f>
+    <PublishingExpirationDate xmlns="http://schemas.microsoft.com/sharepoint/v3" xsi:nil="true"/>
+    <PublishingStartDate xmlns="http://schemas.microsoft.com/sharepoint/v3" xsi:nil="true"/>
+  </documentManagement>
+</p:properties>
+</file>
+
+<file path=customXml/item3.xml><?xml version="1.0" encoding="utf-8"?>
 <ct:contentTypeSchema xmlns:ct="http://schemas.microsoft.com/office/2006/metadata/contentType" xmlns:ma="http://schemas.microsoft.com/office/2006/metadata/properties/metaAttributes" ct:_="" ma:_="" ma:contentTypeName="Document" ma:contentTypeID="0x010100EB6F09AC4A6F664FBABEDC39250815FB" ma:contentTypeVersion="14" ma:contentTypeDescription="Create a new document." ma:contentTypeScope="" ma:versionID="5dde4337bcedb654d79ec1a33169c356">
   <xsd:schema xmlns:xsd="http://www.w3.org/2001/XMLSchema" xmlns:xs="http://www.w3.org/2001/XMLSchema" xmlns:p="http://schemas.microsoft.com/office/2006/metadata/properties" xmlns:ns1="http://schemas.microsoft.com/sharepoint/v3" xmlns:ns2="dd2a4ee4-6b09-42b9-9a64-8c33b4bfb8dd" xmlns:ns3="f65afe6d-7162-4df4-ae98-80745cab72d4" targetNamespace="http://schemas.microsoft.com/office/2006/metadata/properties" ma:root="true" ma:fieldsID="7009531886d89c565c0c5fa29869ce2b" ns1:_="" ns2:_="" ns3:_="">
     <xsd:import namespace="http://schemas.microsoft.com/sharepoint/v3"/>
@@ -2032,48 +2749,13 @@
 </ct:contentTypeSchema>
 </file>
 
-<file path=customXml/item2.xml><?xml version="1.0" encoding="utf-8"?>
+<file path=customXml/item4.xml><?xml version="1.0" encoding="utf-8"?>
 <go:gDocsCustomXmlDataStorage xmlns:go="http://customooxmlschemas.google.com/" xmlns:r="http://schemas.openxmlformats.org/officeDocument/2006/relationships">
   <go:docsCustomData xmlns:go="http://customooxmlschemas.google.com/" roundtripDataSignature="AMtx7mj5f/nxVGksByVADI6Nb+V2OW/zkg==">AMUW2mXmHuYVExC7V9/I98knXYG63TDShuy1XHhvc9isPjbsm4jifgcl7aUwUAzdt5HMSNe/WUdde1whGMj0B4kMe2uHwkFBeQwsuwwsYYqnkNN73DchmuNiSSwJTN5Mr3vbVoupicU3</go:docsCustomData>
 </go:gDocsCustomXmlDataStorage>
 </file>
 
-<file path=customXml/item3.xml><?xml version="1.0" encoding="utf-8"?>
-<?mso-contentType ?>
-<FormTemplates xmlns="http://schemas.microsoft.com/sharepoint/v3/contenttype/forms">
-  <Display>DocumentLibraryForm</Display>
-  <Edit>DocumentLibraryForm</Edit>
-  <New>DocumentLibraryForm</New>
-</FormTemplates>
-</file>
-
-<file path=customXml/item4.xml><?xml version="1.0" encoding="utf-8"?>
-<p:properties xmlns:p="http://schemas.microsoft.com/office/2006/metadata/properties" xmlns:xsi="http://www.w3.org/2001/XMLSchema-instance" xmlns:pc="http://schemas.microsoft.com/office/infopath/2007/PartnerControls">
-  <documentManagement>
-    <TaxCatchAll xmlns="f65afe6d-7162-4df4-ae98-80745cab72d4" xsi:nil="true"/>
-    <lcf76f155ced4ddcb4097134ff3c332f xmlns="dd2a4ee4-6b09-42b9-9a64-8c33b4bfb8dd">
-      <Terms xmlns="http://schemas.microsoft.com/office/infopath/2007/PartnerControls"/>
-    </lcf76f155ced4ddcb4097134ff3c332f>
-    <PublishingExpirationDate xmlns="http://schemas.microsoft.com/sharepoint/v3" xsi:nil="true"/>
-    <PublishingStartDate xmlns="http://schemas.microsoft.com/sharepoint/v3" xsi:nil="true"/>
-  </documentManagement>
-</p:properties>
-</file>
-
 <file path=customXml/itemProps1.xml><?xml version="1.0" encoding="utf-8"?>
-<ds:datastoreItem xmlns:ds="http://schemas.openxmlformats.org/officeDocument/2006/customXml" ds:itemID="{FBCADEC2-C6D2-4335-80F9-FACE80F98EAB}"/>
-</file>
-
-<file path=customXml/itemProps2.xml><?xml version="1.0" encoding="utf-8"?>
-<ds:datastoreItem xmlns:ds="http://schemas.openxmlformats.org/officeDocument/2006/customXml" ds:itemID="{11111111-1234-1234-1234-123412341234}">
-  <ds:schemaRefs>
-    <ds:schemaRef ds:uri="http://customooxmlschemas.google.com/"/>
-    <ds:schemaRef ds:uri="http://schemas.openxmlformats.org/officeDocument/2006/relationships"/>
-  </ds:schemaRefs>
-</ds:datastoreItem>
-</file>
-
-<file path=customXml/itemProps3.xml><?xml version="1.0" encoding="utf-8"?>
 <ds:datastoreItem xmlns:ds="http://schemas.openxmlformats.org/officeDocument/2006/customXml" ds:itemID="{6FFD2DC6-EF32-47A1-89B5-2E3ACF247C4B}">
   <ds:schemaRefs>
     <ds:schemaRef ds:uri="http://schemas.microsoft.com/sharepoint/v3/contenttype/forms"/>
@@ -2081,7 +2763,7 @@
 </ds:datastoreItem>
 </file>
 
-<file path=customXml/itemProps4.xml><?xml version="1.0" encoding="utf-8"?>
+<file path=customXml/itemProps2.xml><?xml version="1.0" encoding="utf-8"?>
 <ds:datastoreItem xmlns:ds="http://schemas.openxmlformats.org/officeDocument/2006/customXml" ds:itemID="{0A5AD19D-5106-40E7-8791-BA981A9EC4AC}">
   <ds:schemaRefs>
     <ds:schemaRef ds:uri="http://schemas.microsoft.com/office/2006/metadata/properties"/>
@@ -2093,6 +2775,35 @@
 </ds:datastoreItem>
 </file>
 
+<file path=customXml/itemProps3.xml><?xml version="1.0" encoding="utf-8"?>
+<ds:datastoreItem xmlns:ds="http://schemas.openxmlformats.org/officeDocument/2006/customXml" ds:itemID="{FBCADEC2-C6D2-4335-80F9-FACE80F98EAB}">
+  <ds:schemaRefs>
+    <ds:schemaRef ds:uri="http://schemas.microsoft.com/office/2006/metadata/contentType"/>
+    <ds:schemaRef ds:uri="http://schemas.microsoft.com/office/2006/metadata/properties/metaAttributes"/>
+    <ds:schemaRef ds:uri="http://www.w3.org/2001/XMLSchema"/>
+    <ds:schemaRef ds:uri="http://schemas.microsoft.com/office/2006/metadata/properties"/>
+    <ds:schemaRef ds:uri="http://schemas.microsoft.com/sharepoint/v3"/>
+    <ds:schemaRef ds:uri="dd2a4ee4-6b09-42b9-9a64-8c33b4bfb8dd"/>
+    <ds:schemaRef ds:uri="f65afe6d-7162-4df4-ae98-80745cab72d4"/>
+    <ds:schemaRef ds:uri="http://schemas.microsoft.com/office/2006/documentManagement/types"/>
+    <ds:schemaRef ds:uri="http://schemas.microsoft.com/office/infopath/2007/PartnerControls"/>
+    <ds:schemaRef ds:uri="http://schemas.openxmlformats.org/package/2006/metadata/core-properties"/>
+    <ds:schemaRef ds:uri="http://purl.org/dc/elements/1.1/"/>
+    <ds:schemaRef ds:uri="http://purl.org/dc/terms/"/>
+    <ds:schemaRef ds:uri="http://schemas.microsoft.com/internal/obd"/>
+  </ds:schemaRefs>
+</ds:datastoreItem>
+</file>
+
+<file path=customXml/itemProps4.xml><?xml version="1.0" encoding="utf-8"?>
+<ds:datastoreItem xmlns:ds="http://schemas.openxmlformats.org/officeDocument/2006/customXml" ds:itemID="{11111111-1234-1234-1234-123412341234}">
+  <ds:schemaRefs>
+    <ds:schemaRef ds:uri="http://customooxmlschemas.google.com/"/>
+    <ds:schemaRef ds:uri="http://schemas.openxmlformats.org/officeDocument/2006/relationships"/>
+  </ds:schemaRefs>
+</ds:datastoreItem>
+</file>
+
 <file path=docMetadata/LabelInfo.xml><?xml version="1.0" encoding="utf-8"?>
 <clbl:labelList xmlns:clbl="http://schemas.microsoft.com/office/2020/mipLabelMetadata">
   <clbl:label id="{6b558183-044c-4105-8d9c-cea02a2a3d86}" enabled="1" method="Standard" siteId="{43083d15-7273-40c1-b7db-39efd9ccc17a}" removed="0"/>

</xml_diff>